<commit_message>
new file:   backend/chat-agent/src/main/resources/application.properties 	modified:   backend/chat-agent/src/main/resources/application.yml 	modified:   frontend/package-lock.json 	modified:   frontend/package.json 	modified:   frontend/src/App.vue 	modified:   frontend/vite.config.js
</commit_message>
<xml_diff>
--- a/doc/项目流程.docx
+++ b/doc/项目流程.docx
@@ -469,67 +469,52 @@
           <w:rFonts w:hint="eastAsia"/>
           <w:lang w:val="en-US" w:eastAsia="zh-CN"/>
         </w:rPr>
-        <w:t>26.添加防重放攻击Nonce:使用Redis存储已用随机数，防止请求重放</w:t>
-      </w:r>
-    </w:p>
-    <w:p>
-      <w:pPr>
-        <w:rPr>
-          <w:rFonts w:hint="eastAsia"/>
-          <w:lang w:val="en-US" w:eastAsia="zh-CN"/>
-        </w:rPr>
-      </w:pPr>
-      <w:r>
-        <w:rPr>
-          <w:rFonts w:hint="eastAsia"/>
-          <w:lang w:val="en-US" w:eastAsia="zh-CN"/>
-        </w:rPr>
-        <w:t>27.添加对话内容AES-256加密存储:聊天记录密文存储，防止数据库泄露</w:t>
-      </w:r>
-    </w:p>
-    <w:p>
-      <w:pPr>
-        <w:rPr>
-          <w:rFonts w:hint="eastAsia"/>
-          <w:lang w:val="en-US" w:eastAsia="zh-CN"/>
-        </w:rPr>
-      </w:pPr>
-      <w:r>
-        <w:rPr>
-          <w:rFonts w:hint="eastAsia"/>
-          <w:lang w:val="en-US" w:eastAsia="zh-CN"/>
-        </w:rPr>
-        <w:t>28.添加JWT Token刷新机制:短期Token+长期RefreshToken，自动续期</w:t>
-      </w:r>
-    </w:p>
-    <w:p>
-      <w:pPr>
-        <w:rPr>
-          <w:rFonts w:hint="eastAsia"/>
-          <w:lang w:val="en-US" w:eastAsia="zh-CN"/>
-        </w:rPr>
-      </w:pPr>
-      <w:r>
-        <w:rPr>
-          <w:rFonts w:hint="eastAsia"/>
-          <w:lang w:val="en-US" w:eastAsia="zh-CN"/>
-        </w:rPr>
-        <w:t>29.添加敏感词过滤:拦截用户输入和AI输出中的敏感词汇</w:t>
-      </w:r>
-    </w:p>
-    <w:p>
-      <w:pPr>
-        <w:rPr>
-          <w:rFonts w:hint="eastAsia"/>
-          <w:lang w:val="en-US" w:eastAsia="zh-CN"/>
-        </w:rPr>
-      </w:pPr>
-      <w:r>
-        <w:rPr>
-          <w:rFonts w:hint="eastAsia"/>
-          <w:lang w:val="en-US" w:eastAsia="zh-CN"/>
-        </w:rPr>
-        <w:t>30</w:t>
+        <w:t>26.添加HTTPS配置:加密传输数据，防止中间人攻击</w:t>
+      </w:r>
+    </w:p>
+    <w:p>
+      <w:pPr>
+        <w:rPr>
+          <w:rFonts w:hint="eastAsia"/>
+          <w:lang w:val="en-US" w:eastAsia="zh-CN"/>
+        </w:rPr>
+      </w:pPr>
+      <w:r>
+        <w:rPr>
+          <w:rFonts w:hint="eastAsia"/>
+          <w:lang w:val="en-US" w:eastAsia="zh-CN"/>
+        </w:rPr>
+        <w:t>27.添加防重放攻击Nonce:使用Redis存储已用随机数，防止请求重放</w:t>
+      </w:r>
+    </w:p>
+    <w:p>
+      <w:pPr>
+        <w:rPr>
+          <w:rFonts w:hint="eastAsia"/>
+          <w:lang w:val="en-US" w:eastAsia="zh-CN"/>
+        </w:rPr>
+      </w:pPr>
+      <w:r>
+        <w:rPr>
+          <w:rFonts w:hint="eastAsia"/>
+          <w:lang w:val="en-US" w:eastAsia="zh-CN"/>
+        </w:rPr>
+        <w:t>28.添加对话内容AES-256加密存储:聊天记录密文存储，防止数据库泄露</w:t>
+      </w:r>
+    </w:p>
+    <w:p>
+      <w:pPr>
+        <w:rPr>
+          <w:rFonts w:hint="eastAsia"/>
+          <w:lang w:val="en-US" w:eastAsia="zh-CN"/>
+        </w:rPr>
+      </w:pPr>
+      <w:r>
+        <w:rPr>
+          <w:rFonts w:hint="eastAsia"/>
+          <w:lang w:val="en-US" w:eastAsia="zh-CN"/>
+        </w:rPr>
+        <w:t>29.添加JWT Token刷新机制:短期Token+长期Refre</w:t>
       </w:r>
       <w:bookmarkStart w:id="0" w:name="_GoBack"/>
       <w:bookmarkEnd w:id="0"/>
@@ -538,7 +523,37 @@
           <w:rFonts w:hint="eastAsia"/>
           <w:lang w:val="en-US" w:eastAsia="zh-CN"/>
         </w:rPr>
-        <w:t>.添加双因素认证2FA/TOTP:登录时额外验证动态验证码</w:t>
+        <w:t>shToken，自动续期</w:t>
+      </w:r>
+    </w:p>
+    <w:p>
+      <w:pPr>
+        <w:rPr>
+          <w:rFonts w:hint="eastAsia"/>
+          <w:lang w:val="en-US" w:eastAsia="zh-CN"/>
+        </w:rPr>
+      </w:pPr>
+      <w:r>
+        <w:rPr>
+          <w:rFonts w:hint="eastAsia"/>
+          <w:lang w:val="en-US" w:eastAsia="zh-CN"/>
+        </w:rPr>
+        <w:t>30.添加敏感词过滤:拦截用户输入和AI输出中的敏感词汇</w:t>
+      </w:r>
+    </w:p>
+    <w:p>
+      <w:pPr>
+        <w:rPr>
+          <w:rFonts w:hint="eastAsia"/>
+          <w:lang w:val="en-US" w:eastAsia="zh-CN"/>
+        </w:rPr>
+      </w:pPr>
+      <w:r>
+        <w:rPr>
+          <w:rFonts w:hint="eastAsia"/>
+          <w:lang w:val="en-US" w:eastAsia="zh-CN"/>
+        </w:rPr>
+        <w:t>31.添加双因素认证2FA/TOTP:登录时额外验证动态验证码</w:t>
       </w:r>
     </w:p>
     <w:sectPr>

</xml_diff>